<commit_message>
Update - Plant port checklist
</commit_message>
<xml_diff>
--- a/ideas_ressources_files/game_design_document.docx
+++ b/ideas_ressources_files/game_design_document.docx
@@ -9,11 +9,16 @@
         <w:jc w:val="center"/>
       </w:pPr>
       <w:r>
-        <w:t>Plants vs Zombies:</w:t>
+        <w:t>PVZ ZPG</w:t>
+      </w:r>
+      <w:r>
+        <w:t xml:space="preserve"> –</w:t>
       </w:r>
       <w:r>
         <w:br/>
-        <w:t>Zombie-Playing Zombie</w:t>
+      </w:r>
+      <w:r>
+        <w:t>The Zombie RPG</w:t>
       </w:r>
     </w:p>
     <w:p>
@@ -66,6 +71,27 @@
       </w:r>
       <w:r>
         <w:t xml:space="preserve"> and using a turn-based fighting system for each level.</w:t>
+      </w:r>
+    </w:p>
+    <w:p>
+      <w:r>
+        <w:t xml:space="preserve">It takes inspiration from </w:t>
+      </w:r>
+      <w:r>
+        <w:rPr>
+          <w:i/>
+          <w:iCs/>
+        </w:rPr>
+        <w:t>Dungeon Clawler</w:t>
+      </w:r>
+      <w:r>
+        <w:t xml:space="preserve"> by Stray Fawn Studios for its dungeon crawler</w:t>
+      </w:r>
+      <w:r>
+        <w:t xml:space="preserve"> and roguelike</w:t>
+      </w:r>
+      <w:r>
+        <w:t xml:space="preserve"> elements.</w:t>
       </w:r>
     </w:p>
     <w:p>
@@ -235,7 +261,11 @@
         <w:t xml:space="preserve"> C</w:t>
       </w:r>
       <w:r>
-        <w:t>ertain criteria influence which plants appear in which tiles. For example, while possible, plants with an ability that has an area of effect (AOE) are less likely to spawn in the corners and edges, and Protector-type plants are less likely to spawn in the last columns.</w:t>
+        <w:t xml:space="preserve">ertain criteria influence which plants appear in which tiles. For example, while possible, plants with an </w:t>
+      </w:r>
+      <w:r>
+        <w:lastRenderedPageBreak/>
+        <w:t>ability that has an area of effect (AOE) are less likely to spawn in the corners and edges, and Protector-type plants are less likely to spawn in the last columns.</w:t>
       </w:r>
     </w:p>
     <w:p>
@@ -244,7 +274,6 @@
         <w:ind w:left="284"/>
       </w:pPr>
       <w:r>
-        <w:lastRenderedPageBreak/>
         <w:t>2 – Turn Order</w:t>
       </w:r>
     </w:p>

</xml_diff>

<commit_message>
Update - Transfered concept files to new general repository
</commit_message>
<xml_diff>
--- a/ideas_ressources_files/game_design_document.docx
+++ b/ideas_ressources_files/game_design_document.docx
@@ -1,6 +1,6 @@
 
 <file path=word/document.xml><?xml version="1.0" encoding="utf-8"?>
-<w:document xmlns:wpc="http://schemas.microsoft.com/office/word/2010/wordprocessingCanvas" xmlns:cx="http://schemas.microsoft.com/office/drawing/2014/chartex" xmlns:cx1="http://schemas.microsoft.com/office/drawing/2015/9/8/chartex" xmlns:cx2="http://schemas.microsoft.com/office/drawing/2015/10/21/chartex" xmlns:cx3="http://schemas.microsoft.com/office/drawing/2016/5/9/chartex" xmlns:cx4="http://schemas.microsoft.com/office/drawing/2016/5/10/chartex" xmlns:cx5="http://schemas.microsoft.com/office/drawing/2016/5/11/chartex" xmlns:cx6="http://schemas.microsoft.com/office/drawing/2016/5/12/chartex" xmlns:cx7="http://schemas.microsoft.com/office/drawing/2016/5/13/chartex" xmlns:cx8="http://schemas.microsoft.com/office/drawing/2016/5/14/chartex" xmlns:mc="http://schemas.openxmlformats.org/markup-compatibility/2006" xmlns:aink="http://schemas.microsoft.com/office/drawing/2016/ink" xmlns:am3d="http://schemas.microsoft.com/office/drawing/2017/model3d" xmlns:o="urn:schemas-microsoft-com:office:office" xmlns:oel="http://schemas.microsoft.com/office/2019/extlst" xmlns:r="http://schemas.openxmlformats.org/officeDocument/2006/relationships" xmlns:m="http://schemas.openxmlformats.org/officeDocument/2006/math" xmlns:v="urn:schemas-microsoft-com:vml" xmlns:wp14="http://schemas.microsoft.com/office/word/2010/wordprocessingDrawing" xmlns:wp="http://schemas.openxmlformats.org/drawingml/2006/wordprocessingDrawing" xmlns:w10="urn:schemas-microsoft-com:office:word" xmlns:w="http://schemas.openxmlformats.org/wordprocessingml/2006/main" xmlns:w14="http://schemas.microsoft.com/office/word/2010/wordml" xmlns:w15="http://schemas.microsoft.com/office/word/2012/wordml" xmlns:w16cex="http://schemas.microsoft.com/office/word/2018/wordml/cex" xmlns:w16cid="http://schemas.microsoft.com/office/word/2016/wordml/cid" xmlns:w16="http://schemas.microsoft.com/office/word/2018/wordml" xmlns:w16du="http://schemas.microsoft.com/office/word/2023/wordml/word16du" xmlns:w16sdtdh="http://schemas.microsoft.com/office/word/2020/wordml/sdtdatahash" xmlns:w16sdtfl="http://schemas.microsoft.com/office/word/2024/wordml/sdtformatlock" xmlns:w16se="http://schemas.microsoft.com/office/word/2015/wordml/symex" xmlns:wpg="http://schemas.microsoft.com/office/word/2010/wordprocessingGroup" xmlns:wpi="http://schemas.microsoft.com/office/word/2010/wordprocessingInk" xmlns:wne="http://schemas.microsoft.com/office/word/2006/wordml" xmlns:wps="http://schemas.microsoft.com/office/word/2010/wordprocessingShape" mc:Ignorable="w14 w15 w16se w16cid w16 w16cex w16sdtdh w16sdtfl w16du wp14">
+<w:document xmlns:wpc="http://schemas.microsoft.com/office/word/2010/wordprocessingCanvas" xmlns:cx="http://schemas.microsoft.com/office/drawing/2014/chartex" xmlns:cx1="http://schemas.microsoft.com/office/drawing/2015/9/8/chartex" xmlns:cx2="http://schemas.microsoft.com/office/drawing/2015/10/21/chartex" xmlns:cx3="http://schemas.microsoft.com/office/drawing/2016/5/9/chartex" xmlns:cx4="http://schemas.microsoft.com/office/drawing/2016/5/10/chartex" xmlns:cx5="http://schemas.microsoft.com/office/drawing/2016/5/11/chartex" xmlns:cx6="http://schemas.microsoft.com/office/drawing/2016/5/12/chartex" xmlns:cx7="http://schemas.microsoft.com/office/drawing/2016/5/13/chartex" xmlns:cx8="http://schemas.microsoft.com/office/drawing/2016/5/14/chartex" xmlns:mc="http://schemas.openxmlformats.org/markup-compatibility/2006" xmlns:aink="http://schemas.microsoft.com/office/drawing/2016/ink" xmlns:am3d="http://schemas.microsoft.com/office/drawing/2017/model3d" xmlns:o="urn:schemas-microsoft-com:office:office" xmlns:oel="http://schemas.microsoft.com/office/2019/extlst" xmlns:r="http://schemas.openxmlformats.org/officeDocument/2006/relationships" xmlns:m="http://schemas.openxmlformats.org/officeDocument/2006/math" xmlns:v="urn:schemas-microsoft-com:vml" xmlns:wp14="http://schemas.microsoft.com/office/word/2010/wordprocessingDrawing" xmlns:wp="http://schemas.openxmlformats.org/drawingml/2006/wordprocessingDrawing" xmlns:w10="urn:schemas-microsoft-com:office:word" xmlns:w="http://schemas.openxmlformats.org/wordprocessingml/2006/main" xmlns:w14="http://schemas.microsoft.com/office/word/2010/wordml" xmlns:w15="http://schemas.microsoft.com/office/word/2012/wordml" xmlns:w16cei="http://schemas.microsoft.com/office/word/2026/wordml/cei" xmlns:w16cex="http://schemas.microsoft.com/office/word/2018/wordml/cex" xmlns:w16cid="http://schemas.microsoft.com/office/word/2016/wordml/cid" xmlns:w16="http://schemas.microsoft.com/office/word/2018/wordml" xmlns:w16du="http://schemas.microsoft.com/office/word/2023/wordml/word16du" xmlns:w16sdtdh="http://schemas.microsoft.com/office/word/2020/wordml/sdtdatahash" xmlns:w16sdtfl="http://schemas.microsoft.com/office/word/2024/wordml/sdtformatlock" xmlns:w16se="http://schemas.microsoft.com/office/word/2015/wordml/symex" xmlns:wpg="http://schemas.microsoft.com/office/word/2010/wordprocessingGroup" xmlns:wpi="http://schemas.microsoft.com/office/word/2010/wordprocessingInk" xmlns:wne="http://schemas.microsoft.com/office/word/2006/wordml" xmlns:wps="http://schemas.microsoft.com/office/word/2010/wordprocessingShape" mc:Ignorable="w14 w15 w16se w16cid w16 w16cex w16sdtdh w16sdtfl w16du wp14">
   <w:body>
     <w:p>
       <w:pPr>
@@ -32,8 +32,13 @@
       </w:r>
     </w:p>
     <w:p>
-      <w:r>
-        <w:t xml:space="preserve">PvZ ZPG is a rogue-like </w:t>
+      <w:proofErr w:type="spellStart"/>
+      <w:r>
+        <w:t>PvZ</w:t>
+      </w:r>
+      <w:proofErr w:type="spellEnd"/>
+      <w:r>
+        <w:t xml:space="preserve"> ZPG is a rogue-like </w:t>
       </w:r>
       <w:r>
         <w:rPr>
@@ -82,8 +87,17 @@
           <w:i/>
           <w:iCs/>
         </w:rPr>
-        <w:t>Dungeon Clawler</w:t>
-      </w:r>
+        <w:t xml:space="preserve">Dungeon </w:t>
+      </w:r>
+      <w:proofErr w:type="spellStart"/>
+      <w:r>
+        <w:rPr>
+          <w:i/>
+          <w:iCs/>
+        </w:rPr>
+        <w:t>Clawler</w:t>
+      </w:r>
+      <w:proofErr w:type="spellEnd"/>
       <w:r>
         <w:t xml:space="preserve"> by Stray Fawn Studios for its dungeon crawler</w:t>
       </w:r>
@@ -279,7 +293,15 @@
     </w:p>
     <w:p>
       <w:r>
-        <w:t>The turn order and current phase is displayed with an icon similar to PvZ Heroes, including a large “End Turn” button for the player to click once they are done.</w:t>
+        <w:t xml:space="preserve">The turn order and current phase is displayed with an icon similar to </w:t>
+      </w:r>
+      <w:proofErr w:type="spellStart"/>
+      <w:r>
+        <w:t>PvZ</w:t>
+      </w:r>
+      <w:proofErr w:type="spellEnd"/>
+      <w:r>
+        <w:t xml:space="preserve"> Heroes, including a large “End Turn” button for the player to click once they are done.</w:t>
       </w:r>
     </w:p>
     <w:p>
@@ -586,7 +608,15 @@
     </w:p>
     <w:p>
       <w:r>
-        <w:t>Straight and Lobbed are essentially the same attack type, only varying in whether they reach the zombie from the side or the top. Ground attacks ignore all armours except Helmets, attacking the zombie directly. Usually, these will target the zombie on the same tile as the plant, such as with Spikeweed. Finally, Heal attacks ignore all armour and simply heal the target instead of damaging it.</w:t>
+        <w:t xml:space="preserve">Straight and Lobbed are essentially the same attack type, only varying in whether they reach the zombie from the side or the top. Ground attacks ignore all armours except Helmets, attacking the zombie directly. Usually, these will target the zombie on the same tile as the plant, such as with </w:t>
+      </w:r>
+      <w:proofErr w:type="spellStart"/>
+      <w:r>
+        <w:t>Spikeweed</w:t>
+      </w:r>
+      <w:proofErr w:type="spellEnd"/>
+      <w:r>
+        <w:t>. Finally, Heal attacks ignore all armour and simply heal the target instead of damaging it.</w:t>
       </w:r>
     </w:p>
     <w:p>
@@ -647,7 +677,15 @@
         <w:t>Grounded</w:t>
       </w:r>
       <w:r>
-        <w:t xml:space="preserve"> makes plants only be attackable by specific means, such as Spikeweed.</w:t>
+        <w:t xml:space="preserve"> makes plants only be attackable by specific means, such as </w:t>
+      </w:r>
+      <w:proofErr w:type="spellStart"/>
+      <w:r>
+        <w:t>Spikeweed</w:t>
+      </w:r>
+      <w:proofErr w:type="spellEnd"/>
+      <w:r>
+        <w:t>.</w:t>
       </w:r>
     </w:p>
     <w:p>
@@ -669,6 +707,7 @@
       <w:r>
         <w:t xml:space="preserve"> means the plant can spawn underneath another, so long as that plant isn’t a Pass-through type. This trait innately gives the benefits of the </w:t>
       </w:r>
+      <w:proofErr w:type="gramStart"/>
       <w:r>
         <w:rPr>
           <w:i/>
@@ -676,6 +715,7 @@
         </w:rPr>
         <w:t>Tiny</w:t>
       </w:r>
+      <w:proofErr w:type="gramEnd"/>
       <w:r>
         <w:t xml:space="preserve"> trait, while removing said trait from the plant on top. Lastly, the plant on top must be vanquished before the </w:t>
       </w:r>
@@ -817,7 +857,15 @@
         <w:t>Pierce</w:t>
       </w:r>
       <w:r>
-        <w:t xml:space="preserve"> allows a Straight type attack to bypass Shield type armour, dealing damage to both the armour and the zombie. </w:t>
+        <w:t xml:space="preserve"> allows a Straight </w:t>
+      </w:r>
+      <w:proofErr w:type="gramStart"/>
+      <w:r>
+        <w:t>type</w:t>
+      </w:r>
+      <w:proofErr w:type="gramEnd"/>
+      <w:r>
+        <w:t xml:space="preserve"> attack to bypass Shield type armour, dealing damage to both the armour and the zombie. </w:t>
       </w:r>
       <w:r>
         <w:rPr>
@@ -1120,7 +1168,15 @@
         <w:t>, w</w:t>
       </w:r>
       <w:r>
-        <w:t>hich, like PvZ Heroes, prevents the plant’s next attack</w:t>
+        <w:t xml:space="preserve">hich, like </w:t>
+      </w:r>
+      <w:proofErr w:type="spellStart"/>
+      <w:r>
+        <w:t>PvZ</w:t>
+      </w:r>
+      <w:proofErr w:type="spellEnd"/>
+      <w:r>
+        <w:t xml:space="preserve"> Heroes, prevents the plant’s next attack</w:t>
       </w:r>
       <w:r>
         <w:t>.</w:t>
@@ -1877,13 +1933,29 @@
     </w:p>
     <w:p>
       <w:r>
-        <w:t xml:space="preserve">Imagine that the Player on the image above moved to the Spikeweed on column 6 in the middle lane to attack the Peashooter. </w:t>
+        <w:t xml:space="preserve">Imagine that the Player on the image above moved to the </w:t>
+      </w:r>
+      <w:proofErr w:type="spellStart"/>
+      <w:r>
+        <w:t>Spikeweed</w:t>
+      </w:r>
+      <w:proofErr w:type="spellEnd"/>
+      <w:r>
+        <w:t xml:space="preserve"> on column 6 in the middle lane to attack the Peashooter. </w:t>
       </w:r>
       <w:r>
         <w:t>Assuming they have no actions left, t</w:t>
       </w:r>
       <w:r>
-        <w:t>he Player would be forced to remain on the Spikeweed and get attacked by it during the Plants Phase. On the next turn, their movement would be as follows:</w:t>
+        <w:t xml:space="preserve">he Player would be forced to remain on the </w:t>
+      </w:r>
+      <w:proofErr w:type="spellStart"/>
+      <w:r>
+        <w:t>Spikeweed</w:t>
+      </w:r>
+      <w:proofErr w:type="spellEnd"/>
+      <w:r>
+        <w:t xml:space="preserve"> and get attacked by it during the Plants Phase. On the next turn, their movement would be as follows:</w:t>
       </w:r>
     </w:p>
     <w:p>
@@ -2072,7 +2144,15 @@
     <w:p>
       <w:r>
         <w:lastRenderedPageBreak/>
-        <w:t>A Spawnling’s items don’t reveal Almanac entries and are entirely reliant on the Spawnling. Armours and Accessories are automatically already equipped when the Spawnling is spawned and can never be unequipped.</w:t>
+        <w:t xml:space="preserve">A </w:t>
+      </w:r>
+      <w:proofErr w:type="spellStart"/>
+      <w:r>
+        <w:t>Spawnling’s</w:t>
+      </w:r>
+      <w:proofErr w:type="spellEnd"/>
+      <w:r>
+        <w:t xml:space="preserve"> items don’t reveal Almanac entries and are entirely reliant on the Spawnling. Armours and Accessories are automatically already equipped when the Spawnling is spawned and can never be unequipped.</w:t>
       </w:r>
     </w:p>
     <w:p>
@@ -2325,7 +2405,15 @@
         <w:t>Traverse</w:t>
       </w:r>
       <w:r>
-        <w:t xml:space="preserve"> allows a Ranged type attack to bypass Protector type plants, dealing damage to the desired target, and allows </w:t>
+        <w:t xml:space="preserve"> allows a Ranged </w:t>
+      </w:r>
+      <w:proofErr w:type="gramStart"/>
+      <w:r>
+        <w:t>type</w:t>
+      </w:r>
+      <w:proofErr w:type="gramEnd"/>
+      <w:r>
+        <w:t xml:space="preserve"> attack to bypass Protector type plants, dealing damage to the desired target, and allows </w:t>
       </w:r>
       <w:r>
         <w:t>Melee</w:t>
@@ -2763,20 +2851,10 @@
           <w:i/>
           <w:iCs/>
         </w:rPr>
-        <w:t>Butter</w:t>
-      </w:r>
-      <w:r>
-        <w:t xml:space="preserve"> effectively makes the same effect as the </w:t>
-      </w:r>
-      <w:r>
-        <w:rPr>
-          <w:i/>
-          <w:iCs/>
-        </w:rPr>
-        <w:t>Stun</w:t>
-      </w:r>
-      <w:r>
-        <w:t xml:space="preserve"> trait, but only has a ¼ chance of inflicting the status condition.</w:t>
+        <w:t>Poison (n)</w:t>
+      </w:r>
+      <w:r>
+        <w:t xml:space="preserve"> is a stackable trait that deals damage to the zombie, ignoring armour, at the start of every turn. The stack reduces by one at the end of each turn, eventually leading to the zombie losing the trait altogether.</w:t>
       </w:r>
     </w:p>
     <w:p>
@@ -2793,29 +2871,16 @@
           <w:i/>
           <w:iCs/>
         </w:rPr>
-        <w:t>Poison (n)</w:t>
-      </w:r>
-      <w:r>
-        <w:t xml:space="preserve"> is a stackable trait that deals damage to the zombie, ignoring armour, at the start of every turn. The stack reduces by one at the end of each turn, eventually leading to the zombie losing the trait altogether.</w:t>
-      </w:r>
-    </w:p>
-    <w:p>
-      <w:pPr>
-        <w:pStyle w:val="Paragraphedeliste"/>
-        <w:numPr>
-          <w:ilvl w:val="0"/>
-          <w:numId w:val="12"/>
-        </w:numPr>
-        <w:ind w:left="284"/>
-      </w:pPr>
-      <w:r>
-        <w:rPr>
-          <w:i/>
-          <w:iCs/>
-        </w:rPr>
         <w:t>Hypnotize</w:t>
       </w:r>
       <w:r>
+        <w:rPr>
+          <w:i/>
+          <w:iCs/>
+        </w:rPr>
+        <w:t>d</w:t>
+      </w:r>
+      <w:r>
         <w:t xml:space="preserve"> gives all attacks the </w:t>
       </w:r>
       <w:r>
@@ -2826,7 +2891,13 @@
         <w:t>Friendly Fire</w:t>
       </w:r>
       <w:r>
-        <w:t xml:space="preserve"> trait for one turn, preventing plants from being targeted directly.</w:t>
+        <w:t xml:space="preserve"> trait for one turn, </w:t>
+      </w:r>
+      <w:r>
+        <w:t>and prevents</w:t>
+      </w:r>
+      <w:r>
+        <w:t xml:space="preserve"> plants from being targeted directly.</w:t>
       </w:r>
     </w:p>
     <w:p>
@@ -2866,7 +2937,15 @@
     </w:p>
     <w:p>
       <w:r>
-        <w:t>Each area is inspired by one or more worlds, regions or otherwise relevant places from games all throughout the PvZ Franchise. Aside from their unique visual themes, they each have their own specific pool of plants, available loot, in both items and Spawnlings, and, of course, their own bosses.</w:t>
+        <w:t xml:space="preserve">Each area is inspired by one or more worlds, regions or otherwise relevant places from games all throughout the </w:t>
+      </w:r>
+      <w:proofErr w:type="spellStart"/>
+      <w:r>
+        <w:t>PvZ</w:t>
+      </w:r>
+      <w:proofErr w:type="spellEnd"/>
+      <w:r>
+        <w:t xml:space="preserve"> Franchise. Aside from their unique visual themes, they each have their own specific pool of plants, available loot, in both items and Spawnlings, and, of course, their own bosses.</w:t>
       </w:r>
     </w:p>
     <w:p>
@@ -2922,14 +3001,14 @@
     </w:p>
     <w:p>
       <w:r>
-        <w:t xml:space="preserve">These gardens will play similarly to regular Fighting Gardens, but with an interesting twist, in the form of the plant pool or specific completion objectives. Beating a Game Garden will award the player with rewards ranging from rare or specific loot items to larger sums of </w:t>
+        <w:t>These gardens will play similarly to regular Fighting Gardens, but with an interesting twist, in the form of the plant pool or specific completion objectives. Beating a Game Garden will award the player with rewards ranging from rare or specific loot items to larger sums of Brainiac Coins</w:t>
+      </w:r>
+      <w:r>
+        <w:t xml:space="preserve">. However, they will typically be more difficult to complete, making them a </w:t>
       </w:r>
       <w:r>
         <w:lastRenderedPageBreak/>
-        <w:t>Brainiac Coins</w:t>
-      </w:r>
-      <w:r>
-        <w:t>. However, they will typically be more difficult to complete, making them a high risk, high reward scenario</w:t>
+        <w:t>high risk, high reward scenario</w:t>
       </w:r>
       <w:r>
         <w:t>.</w:t>
@@ -2958,7 +3037,23 @@
     </w:p>
     <w:p>
       <w:r>
-        <w:t>While many plants receive boss status because of their original power level or because they fit it thematically, there are also two types of plants that have been upgraded to receive boss status, those being PvZ 2’s Power-mints and PvZ Heroes’ titulary characters.</w:t>
+        <w:t xml:space="preserve">While many plants receive boss status because of their original power level or because they fit it thematically, there are also two types of plants that have been upgraded to receive boss status, those being </w:t>
+      </w:r>
+      <w:proofErr w:type="spellStart"/>
+      <w:r>
+        <w:t>PvZ</w:t>
+      </w:r>
+      <w:proofErr w:type="spellEnd"/>
+      <w:r>
+        <w:t xml:space="preserve"> 2’s Power-mints and </w:t>
+      </w:r>
+      <w:proofErr w:type="spellStart"/>
+      <w:r>
+        <w:t>PvZ</w:t>
+      </w:r>
+      <w:proofErr w:type="spellEnd"/>
+      <w:r>
+        <w:t xml:space="preserve"> Heroes’ titulary characters.</w:t>
       </w:r>
     </w:p>
     <w:p>
@@ -2999,7 +3094,15 @@
         <w:t>The area can later reappear during any playthrough. During these visits, the pool of plants, Spawnlings and items is expanded to notably fit new sports-themed additions</w:t>
       </w:r>
       <w:r>
-        <w:t>, as well as Grass Knuckles from PvZ Heroes as a boss.</w:t>
+        <w:t xml:space="preserve">, as well as Grass Knuckles from </w:t>
+      </w:r>
+      <w:proofErr w:type="spellStart"/>
+      <w:r>
+        <w:t>PvZ</w:t>
+      </w:r>
+      <w:proofErr w:type="spellEnd"/>
+      <w:r>
+        <w:t xml:space="preserve"> Heroes as a boss.</w:t>
       </w:r>
     </w:p>
     <w:p>
@@ -3013,12 +3116,51 @@
     </w:p>
     <w:p>
       <w:r>
-        <w:t>The Neighbour’s House is the broadest of all maps in its references. It mostly serves as a reference to fellow fan-game PvZ Rogue Garden, with its season and night cycle. Additionally, these are used to incorporate elements from PvZ’s Pool and Fog levels as well PvZ 2’s Frostbite Caves. It also includes infamous Brownparka zombies from PvZ Rogue Garden as Spawnlings.</w:t>
-      </w:r>
-    </w:p>
-    <w:p>
-      <w:r>
-        <w:lastRenderedPageBreak/>
+        <w:t xml:space="preserve">The Neighbour’s House is the broadest of all maps in its references. It mostly serves as a reference to fellow fan-game </w:t>
+      </w:r>
+      <w:proofErr w:type="spellStart"/>
+      <w:r>
+        <w:t>PvZ</w:t>
+      </w:r>
+      <w:proofErr w:type="spellEnd"/>
+      <w:r>
+        <w:t xml:space="preserve"> Rogue Garden, with its season and night cycle. Additionally, these are used to incorporate elements from </w:t>
+      </w:r>
+      <w:proofErr w:type="spellStart"/>
+      <w:r>
+        <w:t>PvZ’s</w:t>
+      </w:r>
+      <w:proofErr w:type="spellEnd"/>
+      <w:r>
+        <w:t xml:space="preserve"> Pool and Fog levels as well </w:t>
+      </w:r>
+      <w:proofErr w:type="spellStart"/>
+      <w:r>
+        <w:t>PvZ</w:t>
+      </w:r>
+      <w:proofErr w:type="spellEnd"/>
+      <w:r>
+        <w:t xml:space="preserve"> 2’s Frostbite Caves. It also includes infamous </w:t>
+      </w:r>
+      <w:proofErr w:type="spellStart"/>
+      <w:r>
+        <w:t>Brownparka</w:t>
+      </w:r>
+      <w:proofErr w:type="spellEnd"/>
+      <w:r>
+        <w:t xml:space="preserve"> zombies from </w:t>
+      </w:r>
+      <w:proofErr w:type="spellStart"/>
+      <w:r>
+        <w:t>PvZ</w:t>
+      </w:r>
+      <w:proofErr w:type="spellEnd"/>
+      <w:r>
+        <w:t xml:space="preserve"> Rogue Garden as Spawnlings.</w:t>
+      </w:r>
+    </w:p>
+    <w:p>
+      <w:r>
         <w:t>This area may spawn non-cardboard plants from other areas (except ZCorp Intra-Space-Time) in addition to its plant pool. This world’s Fighting Gardens can be one of five:</w:t>
       </w:r>
     </w:p>
@@ -3036,6 +3178,7 @@
           <w:b/>
           <w:bCs/>
         </w:rPr>
+        <w:lastRenderedPageBreak/>
         <w:t>Day</w:t>
       </w:r>
       <w:r>
@@ -3151,12 +3294,36 @@
         <w:t>Roof</w:t>
       </w:r>
       <w:r>
-        <w:t xml:space="preserve"> is a reference to PvZ’s final levels. It spawns more lobbed attackers as well as a Flower Pot under most plants.</w:t>
-      </w:r>
-    </w:p>
-    <w:p>
-      <w:r>
-        <w:t>Finally, this world includes a Game Garden based on PvZ 2’s endangered plant levels that the requires the player to vanquish an endangered plant in a given number of rounds.</w:t>
+        <w:t xml:space="preserve"> is a reference to </w:t>
+      </w:r>
+      <w:proofErr w:type="spellStart"/>
+      <w:r>
+        <w:t>PvZ’s</w:t>
+      </w:r>
+      <w:proofErr w:type="spellEnd"/>
+      <w:r>
+        <w:t xml:space="preserve"> final levels. It spawns more lobbed attackers as well as a </w:t>
+      </w:r>
+      <w:proofErr w:type="gramStart"/>
+      <w:r>
+        <w:t>Flower Pot</w:t>
+      </w:r>
+      <w:proofErr w:type="gramEnd"/>
+      <w:r>
+        <w:t xml:space="preserve"> under most plants.</w:t>
+      </w:r>
+    </w:p>
+    <w:p>
+      <w:r>
+        <w:t xml:space="preserve">Finally, this world includes a Game Garden based on </w:t>
+      </w:r>
+      <w:proofErr w:type="spellStart"/>
+      <w:r>
+        <w:t>PvZ</w:t>
+      </w:r>
+      <w:proofErr w:type="spellEnd"/>
+      <w:r>
+        <w:t xml:space="preserve"> 2’s endangered plant levels that the requires the player to vanquish an endangered plant in a given number of rounds.</w:t>
       </w:r>
     </w:p>
     <w:p>
@@ -3189,8 +3356,13 @@
     </w:p>
     <w:p>
       <w:r>
-        <w:t>Old Wild Egypt combines PvZ</w:t>
-      </w:r>
+        <w:t xml:space="preserve">Old Wild Egypt combines </w:t>
+      </w:r>
+      <w:proofErr w:type="spellStart"/>
+      <w:r>
+        <w:t>PvZ</w:t>
+      </w:r>
+      <w:proofErr w:type="spellEnd"/>
       <w:r>
         <w:t xml:space="preserve"> 2</w:t>
       </w:r>
@@ -3235,7 +3407,15 @@
         <w:t xml:space="preserve">Mushroom </w:t>
       </w:r>
       <w:r>
-        <w:t xml:space="preserve">Grotto is the closest to PvZ 2’s Dark Ages, </w:t>
+        <w:t xml:space="preserve">Grotto is the closest to </w:t>
+      </w:r>
+      <w:proofErr w:type="spellStart"/>
+      <w:r>
+        <w:t>PvZ</w:t>
+      </w:r>
+      <w:proofErr w:type="spellEnd"/>
+      <w:r>
+        <w:t xml:space="preserve"> 2’s Dark Ages, </w:t>
       </w:r>
       <w:r>
         <w:t>featuring a large pool of mushrooms, and allowing other non-cardboard mushrooms from other areas to spawn. It features the “Spore Cloud” Garden Gimmick which spawns Puff-shrooms.</w:t>
@@ -3243,7 +3423,15 @@
     </w:p>
     <w:p>
       <w:r>
-        <w:t xml:space="preserve">Castle levels are composed of PvZ 2’s </w:t>
+        <w:t xml:space="preserve">Castle levels are composed of </w:t>
+      </w:r>
+      <w:proofErr w:type="spellStart"/>
+      <w:r>
+        <w:t>PvZ</w:t>
+      </w:r>
+      <w:proofErr w:type="spellEnd"/>
+      <w:r>
+        <w:t xml:space="preserve"> 2’s </w:t>
       </w:r>
       <w:r>
         <w:t>Modern Day plants, and any other plants with the shadow power gimmick. It also features the “Shadow Wave” Garden Gimmick which temporarily shadow-powers every plant.</w:t>
@@ -3251,8 +3439,164 @@
     </w:p>
     <w:p>
       <w:r>
+        <w:t xml:space="preserve">Finally, this area includes the “Holly Gambit” Game Garden, referencing </w:t>
+      </w:r>
+      <w:proofErr w:type="spellStart"/>
+      <w:r>
+        <w:t>PvZ</w:t>
+      </w:r>
+      <w:proofErr w:type="spellEnd"/>
+      <w:r>
+        <w:t xml:space="preserve"> 2’s Holly Barrier, originally named Holly Knight. It includes plants for each chess pieces, using </w:t>
+      </w:r>
+      <w:proofErr w:type="spellStart"/>
+      <w:r>
+        <w:t>PvZ</w:t>
+      </w:r>
+      <w:proofErr w:type="spellEnd"/>
+      <w:r>
+        <w:t xml:space="preserve"> Heroes’ Jolly Holly and </w:t>
+      </w:r>
+      <w:proofErr w:type="spellStart"/>
+      <w:r>
+        <w:t>PvZ</w:t>
+      </w:r>
+      <w:proofErr w:type="spellEnd"/>
+      <w:r>
+        <w:t xml:space="preserve"> 2’s Missile Toe for the bishop and queen respectively, which compose this particular garden’s plant pool</w:t>
+      </w:r>
+      <w:r>
+        <w:t>.</w:t>
+      </w:r>
+    </w:p>
+    <w:p>
+      <w:pPr>
+        <w:pStyle w:val="Titre3"/>
+        <w:ind w:left="284"/>
+      </w:pPr>
+      <w:r>
         <w:lastRenderedPageBreak/>
-        <w:t>Finally, this area includes the “Holly Gambit” Game Garden, referencing PvZ 2’s Holly Barrier, originally named Holly Knight. It includes plants for each chess pieces, using PvZ Heroes’ Jolly Holly and PvZ 2’s Missile Toe for the bishop and queen respectively, which compose this particular garden’s plant pool</w:t>
+        <w:t>Pirate’s Beach</w:t>
+      </w:r>
+    </w:p>
+    <w:p>
+      <w:r>
+        <w:t xml:space="preserve">Pirate’s Beach is simultaneously based on Pirate Seas and Big Wave Beach from </w:t>
+      </w:r>
+      <w:proofErr w:type="spellStart"/>
+      <w:r>
+        <w:t>PvZ</w:t>
+      </w:r>
+      <w:proofErr w:type="spellEnd"/>
+      <w:r>
+        <w:t xml:space="preserve"> 2. </w:t>
+      </w:r>
+      <w:r>
+        <w:t>Like Dark Ages, it includes two garden kinds with their own plant pools.</w:t>
+      </w:r>
+    </w:p>
+    <w:p>
+      <w:r>
+        <w:t>Marine Battle gardens represent the zombies board</w:t>
+      </w:r>
+      <w:r>
+        <w:t>ing</w:t>
+      </w:r>
+      <w:r>
+        <w:t xml:space="preserve"> a plant ship and include “void” tiles, in other words tiles that only flying plants and zombies can go on, like Pirate Seas. Its plant pool is closer to that of Pirate Seas, with more pirate or warfare-</w:t>
+      </w:r>
+      <w:proofErr w:type="spellStart"/>
+      <w:r>
+        <w:t>esque</w:t>
+      </w:r>
+      <w:proofErr w:type="spellEnd"/>
+      <w:r>
+        <w:t xml:space="preserve"> plants.</w:t>
+      </w:r>
+    </w:p>
+    <w:p>
+      <w:r>
+        <w:t xml:space="preserve">Docked Ship gardens represent the zombies docking at a tropical beach. The plant spawn area is partially flooded, and the water tiles vary with the “Low Tide” and “High Tide” </w:t>
+      </w:r>
+      <w:r>
+        <w:t>G</w:t>
+      </w:r>
+      <w:r>
+        <w:t xml:space="preserve">arden Gimmicks. Its plant pool is closer to that of Big Wave Beach and features tropical </w:t>
+      </w:r>
+      <w:r>
+        <w:t xml:space="preserve">new </w:t>
+      </w:r>
+      <w:r>
+        <w:t>additions.</w:t>
+      </w:r>
+    </w:p>
+    <w:p>
+      <w:pPr>
+        <w:pStyle w:val="Titre3"/>
+        <w:ind w:left="284"/>
+      </w:pPr>
+      <w:r>
+        <w:t>Jurassic Marsh</w:t>
+      </w:r>
+    </w:p>
+    <w:p>
+      <w:r>
+        <w:t xml:space="preserve">Jurassic Marsh includes the expected prehistoric zombies and primal plants, but also includes </w:t>
+      </w:r>
+      <w:proofErr w:type="spellStart"/>
+      <w:r>
+        <w:t>PvZ</w:t>
+      </w:r>
+      <w:proofErr w:type="spellEnd"/>
+      <w:r>
+        <w:t xml:space="preserve"> Heroes’ dinosaur-inspired plants and their Dino-Roar mechanic, incorporated as part of a Garden Gimmick of the same name.</w:t>
+      </w:r>
+    </w:p>
+    <w:p>
+      <w:pPr>
+        <w:pStyle w:val="Titre3"/>
+        <w:ind w:left="284"/>
+      </w:pPr>
+      <w:r>
+        <w:t>Neon Carnival</w:t>
+      </w:r>
+    </w:p>
+    <w:p>
+      <w:r>
+        <w:t xml:space="preserve">Neon Carnival is a musical festival, referencing both the Neon Mixtape Tour world and a couple of </w:t>
+      </w:r>
+      <w:proofErr w:type="spellStart"/>
+      <w:r>
+        <w:t>thymed</w:t>
+      </w:r>
+      <w:proofErr w:type="spellEnd"/>
+      <w:r>
+        <w:t xml:space="preserve"> events from </w:t>
+      </w:r>
+      <w:proofErr w:type="spellStart"/>
+      <w:r>
+        <w:t>PvZ</w:t>
+      </w:r>
+      <w:proofErr w:type="spellEnd"/>
+      <w:r>
+        <w:t xml:space="preserve"> 2, notably Backyard Big Top, Summer Nights and </w:t>
+      </w:r>
+      <w:proofErr w:type="spellStart"/>
+      <w:r>
+        <w:t>Valenbrainz</w:t>
+      </w:r>
+      <w:proofErr w:type="spellEnd"/>
+      <w:r>
+        <w:t>. As such it includes a wide range of music and magic-themed plants and loot.</w:t>
+      </w:r>
+    </w:p>
+    <w:p>
+      <w:r>
+        <w:t xml:space="preserve">Aside from the regular Day gardens, it also features the Bog of Enlightenment gardens, with a submerged middle lane and higher spawn rates for </w:t>
+      </w:r>
+      <w:r>
+        <w:t>amphibious plants</w:t>
       </w:r>
       <w:r>
         <w:t>.</w:t>
@@ -3264,43 +3608,57 @@
         <w:ind w:left="284"/>
       </w:pPr>
       <w:r>
-        <w:t>Pirate’s Beach</w:t>
-      </w:r>
-    </w:p>
-    <w:p>
-      <w:r>
-        <w:t xml:space="preserve">Pirate’s Beach is simultaneously based on Pirate Seas and Big Wave Beach from PvZ 2. </w:t>
-      </w:r>
-      <w:r>
-        <w:t>Like Dark Ages, it includes two garden kinds with their own plant pools.</w:t>
-      </w:r>
-    </w:p>
-    <w:p>
-      <w:r>
-        <w:t>Marine Battle gardens represent the zombies board</w:t>
-      </w:r>
-      <w:r>
-        <w:t>ing</w:t>
-      </w:r>
-      <w:r>
-        <w:t xml:space="preserve"> a plant ship and include “void” tiles, in other words tiles that only flying plants and zombies can go on, like Pirate Seas. Its plant pool is closer to that of Pirate Seas, with more pirate or warfare-esque plants.</w:t>
-      </w:r>
-    </w:p>
-    <w:p>
-      <w:r>
-        <w:t xml:space="preserve">Docked Ship gardens represent the zombies docking at a tropical beach. The plant spawn area is partially flooded, and the water tiles vary with the “Low Tide” and “High Tide” </w:t>
-      </w:r>
-      <w:r>
-        <w:t>G</w:t>
-      </w:r>
-      <w:r>
-        <w:t xml:space="preserve">arden Gimmicks. Its plant pool is closer to that of Big Wave Beach and features tropical </w:t>
-      </w:r>
-      <w:r>
-        <w:t xml:space="preserve">new </w:t>
-      </w:r>
-      <w:r>
-        <w:t>additions.</w:t>
+        <w:t>Steam City</w:t>
+      </w:r>
+    </w:p>
+    <w:p>
+      <w:r>
+        <w:t xml:space="preserve">Steam City is an area taking major inspiration from </w:t>
+      </w:r>
+      <w:proofErr w:type="spellStart"/>
+      <w:r>
+        <w:t>PvZ</w:t>
+      </w:r>
+      <w:proofErr w:type="spellEnd"/>
+      <w:r>
+        <w:t xml:space="preserve"> 2 China’s </w:t>
+      </w:r>
+      <w:r>
+        <w:t>Steam Ages and Sky City</w:t>
+      </w:r>
+      <w:r>
+        <w:t>.</w:t>
+      </w:r>
+      <w:r>
+        <w:t xml:space="preserve"> These are respectively represented by the regular Day gardens and Sky Battle gardens, which feature multiple “void” tiles and a wider selection of flying and warfare-based plants. These also feature the “Fog” Garden Gimmick which obscures the plant half of the garden.</w:t>
+      </w:r>
+    </w:p>
+    <w:p>
+      <w:r>
+        <w:t>Additionally, the Greenhouse gardens are fighting gardens based on the Zen Garden area from early development of this very game.</w:t>
+      </w:r>
+      <w:r>
+        <w:t xml:space="preserve"> It includes </w:t>
+      </w:r>
+      <w:proofErr w:type="gramStart"/>
+      <w:r>
+        <w:t>Flower Pots</w:t>
+      </w:r>
+      <w:proofErr w:type="gramEnd"/>
+      <w:r>
+        <w:t xml:space="preserve"> </w:t>
+      </w:r>
+      <w:r>
+        <w:t>on all tiles,</w:t>
+      </w:r>
+      <w:r>
+        <w:t xml:space="preserve"> and prevents the spawning of </w:t>
+      </w:r>
+      <w:r>
+        <w:t>Aerial</w:t>
+      </w:r>
+      <w:r>
+        <w:t xml:space="preserve"> plants.</w:t>
       </w:r>
     </w:p>
     <w:p>
@@ -3309,12 +3667,40 @@
         <w:ind w:left="284"/>
       </w:pPr>
       <w:r>
-        <w:t>Jurassic Marsh</w:t>
-      </w:r>
-    </w:p>
-    <w:p>
-      <w:r>
-        <w:t>Jurassic Marsh includes the expected prehistoric zombies and primal plants, but also includes PvZ Heroes’ dinosaur-inspired plants and their Dino-Roar mechanic, incorporated as part of a Garden Gimmick of the same name.</w:t>
+        <w:t>The Zombosseum</w:t>
+      </w:r>
+    </w:p>
+    <w:p>
+      <w:r>
+        <w:t xml:space="preserve">The Zombosseum is an era geographically set in </w:t>
+      </w:r>
+      <w:proofErr w:type="spellStart"/>
+      <w:r>
+        <w:t>PvZ</w:t>
+      </w:r>
+      <w:proofErr w:type="spellEnd"/>
+      <w:r>
+        <w:t xml:space="preserve"> 2’s </w:t>
+      </w:r>
+      <w:r>
+        <w:t>“</w:t>
+      </w:r>
+      <w:r>
+        <w:t>Penny’s Pursuit</w:t>
+      </w:r>
+      <w:r>
+        <w:t>”</w:t>
+      </w:r>
+      <w:r>
+        <w:t xml:space="preserve"> Rome-inspired world, though timewise it is closer to </w:t>
+      </w:r>
+      <w:proofErr w:type="spellStart"/>
+      <w:r>
+        <w:t>PvZ</w:t>
+      </w:r>
+      <w:proofErr w:type="spellEnd"/>
+      <w:r>
+        <w:t xml:space="preserve"> 2 China’s Renaissance Age. All in all, it encompasses the various plants and zombies from both the Renaissance and Ancient Rome, while also including a wider selection of plants that fit either thematically or geographically.</w:t>
       </w:r>
     </w:p>
     <w:p>
@@ -3323,23 +3709,34 @@
         <w:ind w:left="284"/>
       </w:pPr>
       <w:r>
-        <w:t>Neon Carnival</w:t>
-      </w:r>
-    </w:p>
-    <w:p>
-      <w:r>
-        <w:t>Neon Carnival is a musical festival, referencing both the Neon Mixtape Tour world and a couple of thymed events from PvZ 2, notably Backyard Big Top, Summer Nights and Valenbrainz. As such it includes a wide range of music and magic-themed plants and loot.</w:t>
-      </w:r>
-    </w:p>
-    <w:p>
-      <w:r>
-        <w:t xml:space="preserve">Aside from the regular Day gardens, it also features the Bog of Enlightenment gardens, with a submerged middle lane and higher spawn rates for </w:t>
-      </w:r>
-      <w:r>
-        <w:t>amphibious plants</w:t>
-      </w:r>
-      <w:r>
-        <w:t>.</w:t>
+        <w:lastRenderedPageBreak/>
+        <w:t>Kongfu Mausoleum</w:t>
+      </w:r>
+    </w:p>
+    <w:p>
+      <w:r>
+        <w:t xml:space="preserve">The Kongfu Mausoleum is a combination of all the east-Asian-inspired worlds from the franchise, those being Kongfu World and Heian Age from </w:t>
+      </w:r>
+      <w:proofErr w:type="spellStart"/>
+      <w:r>
+        <w:t>PvZ</w:t>
+      </w:r>
+      <w:proofErr w:type="spellEnd"/>
+      <w:r>
+        <w:t xml:space="preserve"> 2 China and Qin Shi Huang Mausoleum from </w:t>
+      </w:r>
+      <w:proofErr w:type="spellStart"/>
+      <w:r>
+        <w:t>PvZ</w:t>
+      </w:r>
+      <w:proofErr w:type="spellEnd"/>
+      <w:r>
+        <w:t xml:space="preserve"> Online.</w:t>
+      </w:r>
+    </w:p>
+    <w:p>
+      <w:r>
+        <w:t>As such, it has a plant and zombie selection based on those worlds as well as plants native to east Asia.</w:t>
       </w:r>
     </w:p>
     <w:p>
@@ -3348,95 +3745,6 @@
         <w:ind w:left="284"/>
       </w:pPr>
       <w:r>
-        <w:t>Steam City</w:t>
-      </w:r>
-    </w:p>
-    <w:p>
-      <w:r>
-        <w:t xml:space="preserve">Steam City is an area taking major inspiration from PvZ 2 China’s </w:t>
-      </w:r>
-      <w:r>
-        <w:t>Steam Ages and Sky City</w:t>
-      </w:r>
-      <w:r>
-        <w:t>.</w:t>
-      </w:r>
-      <w:r>
-        <w:t xml:space="preserve"> These are respectively represented by the regular Day gardens and Sky Battle gardens, which feature multiple “void” tiles and a wider selection of flying and warfare-based plants. These also feature the “Fog” Garden Gimmick which obscures the plant half of the garden.</w:t>
-      </w:r>
-    </w:p>
-    <w:p>
-      <w:r>
-        <w:t>Additionally, the Greenhouse gardens are fighting gardens based on the Zen Garden area from early development of this very game.</w:t>
-      </w:r>
-      <w:r>
-        <w:t xml:space="preserve"> It includes Flower Pots </w:t>
-      </w:r>
-      <w:r>
-        <w:t>on all tiles,</w:t>
-      </w:r>
-      <w:r>
-        <w:t xml:space="preserve"> and prevents the spawning of </w:t>
-      </w:r>
-      <w:r>
-        <w:t>Aerial</w:t>
-      </w:r>
-      <w:r>
-        <w:t xml:space="preserve"> plants.</w:t>
-      </w:r>
-    </w:p>
-    <w:p>
-      <w:pPr>
-        <w:pStyle w:val="Titre3"/>
-        <w:ind w:left="284"/>
-      </w:pPr>
-      <w:r>
-        <w:lastRenderedPageBreak/>
-        <w:t>The Zombosseum</w:t>
-      </w:r>
-    </w:p>
-    <w:p>
-      <w:r>
-        <w:t xml:space="preserve">The Zombosseum is an era geographically set in PvZ 2’s </w:t>
-      </w:r>
-      <w:r>
-        <w:t>“</w:t>
-      </w:r>
-      <w:r>
-        <w:t>Penny’s Pursuit</w:t>
-      </w:r>
-      <w:r>
-        <w:t>”</w:t>
-      </w:r>
-      <w:r>
-        <w:t xml:space="preserve"> Rome-inspired world, though timewise it is closer to PvZ 2 China’s Renaissance Age. All in all, it encompasses the various plants and zombies from both the Renaissance and Ancient Rome, while also including a wider selection of plants that fit either thematically or geographically.</w:t>
-      </w:r>
-    </w:p>
-    <w:p>
-      <w:pPr>
-        <w:pStyle w:val="Titre3"/>
-        <w:ind w:left="284"/>
-      </w:pPr>
-      <w:r>
-        <w:t>Kongfu Mausoleum</w:t>
-      </w:r>
-    </w:p>
-    <w:p>
-      <w:r>
-        <w:t>The Kongfu Mausoleum is a combination of all the east-Asian-inspired worlds from the franchise, those being Kongfu World and Heian Age from PvZ 2 China and Qin Shi Huang Mausoleum from PvZ Online.</w:t>
-      </w:r>
-    </w:p>
-    <w:p>
-      <w:r>
-        <w:t>As such, it has a plant and zombie selection based on those worlds as well as plants native to east Asia.</w:t>
-      </w:r>
-    </w:p>
-    <w:p>
-      <w:pPr>
-        <w:pStyle w:val="Titre3"/>
-        <w:ind w:left="284"/>
-      </w:pPr>
-      <w:r>
         <w:t>ZCorp Intra-Space-Time</w:t>
       </w:r>
     </w:p>
@@ -3445,17 +3753,41 @@
         <w:t>ZCorp Intra-Space-Time is an</w:t>
       </w:r>
       <w:r>
-        <w:t xml:space="preserve"> area based on PvZ 2’s “Penny’s Pursuit” ZCorp world and its default setting, likely based on the “Time Twister” beta concept. It is set in ZCorp Intra-Space-Time a ZCorp Incorporated HQ set in the void between time and space.</w:t>
-      </w:r>
-    </w:p>
-    <w:p>
-      <w:r>
-        <w:t>It includes all your expected ZCorp-brand Spawnlings and items, and has a space-time-themed plant selection, notably including PvZ Heroes’ cosmic plants. As it exists outside of space-time, it can also spawn any plant from all areas.</w:t>
-      </w:r>
-    </w:p>
-    <w:p>
-      <w:r>
-        <w:t>Aside from the regular “Day” Fighting Garden, it also includes three more based on environments from PvZ Heroes:</w:t>
+        <w:t xml:space="preserve"> area based on </w:t>
+      </w:r>
+      <w:proofErr w:type="spellStart"/>
+      <w:r>
+        <w:t>PvZ</w:t>
+      </w:r>
+      <w:proofErr w:type="spellEnd"/>
+      <w:r>
+        <w:t xml:space="preserve"> 2’s “Penny’s Pursuit” ZCorp world and its default setting, likely based on the “Time Twister” beta concept. It is set in ZCorp Intra-Space-Time a ZCorp Incorporated HQ set in the void between time and space.</w:t>
+      </w:r>
+    </w:p>
+    <w:p>
+      <w:r>
+        <w:t xml:space="preserve">It includes all your expected ZCorp-brand Spawnlings and items, and has a space-time-themed plant selection, notably including </w:t>
+      </w:r>
+      <w:proofErr w:type="spellStart"/>
+      <w:r>
+        <w:t>PvZ</w:t>
+      </w:r>
+      <w:proofErr w:type="spellEnd"/>
+      <w:r>
+        <w:t xml:space="preserve"> Heroes’ cosmic plants. As it exists outside of space-time, it can also spawn any plant from all areas.</w:t>
+      </w:r>
+    </w:p>
+    <w:p>
+      <w:r>
+        <w:t xml:space="preserve">Aside from the regular “Day” Fighting Garden, it also includes three more based on environments from </w:t>
+      </w:r>
+      <w:proofErr w:type="spellStart"/>
+      <w:r>
+        <w:t>PvZ</w:t>
+      </w:r>
+      <w:proofErr w:type="spellEnd"/>
+      <w:r>
+        <w:t xml:space="preserve"> Heroes:</w:t>
       </w:r>
     </w:p>
     <w:p>
@@ -3575,7 +3907,15 @@
         <w:ind w:left="284"/>
       </w:pPr>
       <w:r>
-        <w:t>“Meteor Ztorm” makes a Meteor Z fall on a random tile, which amplifies the damage plants</w:t>
+        <w:t xml:space="preserve">“Meteor </w:t>
+      </w:r>
+      <w:proofErr w:type="spellStart"/>
+      <w:r>
+        <w:t>Ztorm</w:t>
+      </w:r>
+      <w:proofErr w:type="spellEnd"/>
+      <w:r>
+        <w:t>” makes a Meteor Z fall on a random tile, which amplifies the damage plants</w:t>
       </w:r>
       <w:r>
         <w:t xml:space="preserve"> or zombies</w:t>
@@ -3615,13 +3955,20 @@
         <w:pStyle w:val="Titre1"/>
       </w:pPr>
       <w:r>
-        <w:lastRenderedPageBreak/>
         <w:t>Minimal Viable Product</w:t>
       </w:r>
     </w:p>
     <w:p>
       <w:r>
-        <w:t>The Minimal Viable Product (MVP) is the bare minimum required for the game to be playable, in the case of PvZ RPG – The Zombie-Playing Game, this would be:</w:t>
+        <w:t xml:space="preserve">The Minimal Viable Product (MVP) is the bare minimum required for the game to be playable, in the case of </w:t>
+      </w:r>
+      <w:proofErr w:type="spellStart"/>
+      <w:r>
+        <w:t>PvZ</w:t>
+      </w:r>
+      <w:proofErr w:type="spellEnd"/>
+      <w:r>
+        <w:t xml:space="preserve"> RPG – The Zombie-Playing Game, this would be:</w:t>
       </w:r>
     </w:p>
     <w:p>
@@ -3635,6 +3982,7 @@
         <w:ind w:left="284"/>
       </w:pPr>
       <w:r>
+        <w:lastRenderedPageBreak/>
         <w:t>Player enters an Area</w:t>
       </w:r>
     </w:p>
@@ -3808,7 +4156,7 @@
 </file>
 
 <file path=word/numbering.xml><?xml version="1.0" encoding="utf-8"?>
-<w:numbering xmlns:wpc="http://schemas.microsoft.com/office/word/2010/wordprocessingCanvas" xmlns:cx="http://schemas.microsoft.com/office/drawing/2014/chartex" xmlns:cx1="http://schemas.microsoft.com/office/drawing/2015/9/8/chartex" xmlns:cx2="http://schemas.microsoft.com/office/drawing/2015/10/21/chartex" xmlns:cx3="http://schemas.microsoft.com/office/drawing/2016/5/9/chartex" xmlns:cx4="http://schemas.microsoft.com/office/drawing/2016/5/10/chartex" xmlns:cx5="http://schemas.microsoft.com/office/drawing/2016/5/11/chartex" xmlns:cx6="http://schemas.microsoft.com/office/drawing/2016/5/12/chartex" xmlns:cx7="http://schemas.microsoft.com/office/drawing/2016/5/13/chartex" xmlns:cx8="http://schemas.microsoft.com/office/drawing/2016/5/14/chartex" xmlns:mc="http://schemas.openxmlformats.org/markup-compatibility/2006" xmlns:aink="http://schemas.microsoft.com/office/drawing/2016/ink" xmlns:am3d="http://schemas.microsoft.com/office/drawing/2017/model3d" xmlns:o="urn:schemas-microsoft-com:office:office" xmlns:oel="http://schemas.microsoft.com/office/2019/extlst" xmlns:r="http://schemas.openxmlformats.org/officeDocument/2006/relationships" xmlns:m="http://schemas.openxmlformats.org/officeDocument/2006/math" xmlns:v="urn:schemas-microsoft-com:vml" xmlns:wp14="http://schemas.microsoft.com/office/word/2010/wordprocessingDrawing" xmlns:wp="http://schemas.openxmlformats.org/drawingml/2006/wordprocessingDrawing" xmlns:w10="urn:schemas-microsoft-com:office:word" xmlns:w="http://schemas.openxmlformats.org/wordprocessingml/2006/main" xmlns:w14="http://schemas.microsoft.com/office/word/2010/wordml" xmlns:w15="http://schemas.microsoft.com/office/word/2012/wordml" xmlns:w16cex="http://schemas.microsoft.com/office/word/2018/wordml/cex" xmlns:w16cid="http://schemas.microsoft.com/office/word/2016/wordml/cid" xmlns:w16="http://schemas.microsoft.com/office/word/2018/wordml" xmlns:w16du="http://schemas.microsoft.com/office/word/2023/wordml/word16du" xmlns:w16sdtdh="http://schemas.microsoft.com/office/word/2020/wordml/sdtdatahash" xmlns:w16sdtfl="http://schemas.microsoft.com/office/word/2024/wordml/sdtformatlock" xmlns:w16se="http://schemas.microsoft.com/office/word/2015/wordml/symex" xmlns:wpg="http://schemas.microsoft.com/office/word/2010/wordprocessingGroup" xmlns:wpi="http://schemas.microsoft.com/office/word/2010/wordprocessingInk" xmlns:wne="http://schemas.microsoft.com/office/word/2006/wordml" xmlns:wps="http://schemas.microsoft.com/office/word/2010/wordprocessingShape" mc:Ignorable="w14 w15 w16se w16cid w16 w16cex w16sdtdh w16sdtfl w16du wp14">
+<w:numbering xmlns:wpc="http://schemas.microsoft.com/office/word/2010/wordprocessingCanvas" xmlns:cx="http://schemas.microsoft.com/office/drawing/2014/chartex" xmlns:cx1="http://schemas.microsoft.com/office/drawing/2015/9/8/chartex" xmlns:cx2="http://schemas.microsoft.com/office/drawing/2015/10/21/chartex" xmlns:cx3="http://schemas.microsoft.com/office/drawing/2016/5/9/chartex" xmlns:cx4="http://schemas.microsoft.com/office/drawing/2016/5/10/chartex" xmlns:cx5="http://schemas.microsoft.com/office/drawing/2016/5/11/chartex" xmlns:cx6="http://schemas.microsoft.com/office/drawing/2016/5/12/chartex" xmlns:cx7="http://schemas.microsoft.com/office/drawing/2016/5/13/chartex" xmlns:cx8="http://schemas.microsoft.com/office/drawing/2016/5/14/chartex" xmlns:mc="http://schemas.openxmlformats.org/markup-compatibility/2006" xmlns:aink="http://schemas.microsoft.com/office/drawing/2016/ink" xmlns:am3d="http://schemas.microsoft.com/office/drawing/2017/model3d" xmlns:o="urn:schemas-microsoft-com:office:office" xmlns:oel="http://schemas.microsoft.com/office/2019/extlst" xmlns:r="http://schemas.openxmlformats.org/officeDocument/2006/relationships" xmlns:m="http://schemas.openxmlformats.org/officeDocument/2006/math" xmlns:v="urn:schemas-microsoft-com:vml" xmlns:wp14="http://schemas.microsoft.com/office/word/2010/wordprocessingDrawing" xmlns:wp="http://schemas.openxmlformats.org/drawingml/2006/wordprocessingDrawing" xmlns:w10="urn:schemas-microsoft-com:office:word" xmlns:w="http://schemas.openxmlformats.org/wordprocessingml/2006/main" xmlns:w14="http://schemas.microsoft.com/office/word/2010/wordml" xmlns:w15="http://schemas.microsoft.com/office/word/2012/wordml" xmlns:w16cei="http://schemas.microsoft.com/office/word/2026/wordml/cei" xmlns:w16cex="http://schemas.microsoft.com/office/word/2018/wordml/cex" xmlns:w16cid="http://schemas.microsoft.com/office/word/2016/wordml/cid" xmlns:w16="http://schemas.microsoft.com/office/word/2018/wordml" xmlns:w16du="http://schemas.microsoft.com/office/word/2023/wordml/word16du" xmlns:w16sdtdh="http://schemas.microsoft.com/office/word/2020/wordml/sdtdatahash" xmlns:w16sdtfl="http://schemas.microsoft.com/office/word/2024/wordml/sdtformatlock" xmlns:w16se="http://schemas.microsoft.com/office/word/2015/wordml/symex" xmlns:wpg="http://schemas.microsoft.com/office/word/2010/wordprocessingGroup" xmlns:wpi="http://schemas.microsoft.com/office/word/2010/wordprocessingInk" xmlns:wne="http://schemas.microsoft.com/office/word/2006/wordml" xmlns:wps="http://schemas.microsoft.com/office/word/2010/wordprocessingShape" mc:Ignorable="w14 w15 w16se w16cid w16 w16cex w16sdtdh w16sdtfl w16du wp14">
   <w:abstractNum w:abstractNumId="0" w15:restartNumberingAfterBreak="0">
     <w:nsid w:val="06017584"/>
     <w:multiLevelType w:val="hybridMultilevel"/>

</xml_diff>